<commit_message>
Add BarTender migration assistant and hardware print-validation kit
Migration (Tools > Migrate BarTender Templates): recursive .btw folder
scan (header metadata), shared BtwMigration.json tracker with per-file
status/notes, .lbl skeleton creation with optional locked never-printing
backdrop image and data-file field seeding; BtwImportService moved to Core.

Validation kit (Tools > Create Print Validation Kit): Zebra scan-test
labels (Code 128 GDI+ZPL, GS1-128, QR, 2mm dimension border), Avery 5160
alignment sheet + 30-row CSV, duplex front/back orientation pair + CSV.

SOP sections 20 (migration) and 21 (hardware validation checklist), docx
regenerated; 21 new tests incl. an STA render smoke test (134 total).

Co-Authored-By: Claude Fable 5 <noreply@anthropic.com>
</commit_message>
<xml_diff>
--- a/docs/LabelDesigner_SOP.docx
+++ b/docs/LabelDesigner_SOP.docx
@@ -339,6 +339,36 @@
       </w:r>
       <w:r>
         <w:t>IT Setup &amp; Deployment</w:t>
+      </w:r>
+    </w:p>
+    <w:p>
+      <w:pPr>
+        <w:spacing w:after="40"/>
+      </w:pPr>
+      <w:r>
+        <w:rPr>
+          <w:b/>
+          <w:color w:val="1F497D"/>
+        </w:rPr>
+        <w:t xml:space="preserve">20.  </w:t>
+      </w:r>
+      <w:r>
+        <w:t>Migrating from BarTender</w:t>
+      </w:r>
+    </w:p>
+    <w:p>
+      <w:pPr>
+        <w:spacing w:after="40"/>
+      </w:pPr>
+      <w:r>
+        <w:rPr>
+          <w:b/>
+          <w:color w:val="1F497D"/>
+        </w:rPr>
+        <w:t xml:space="preserve">21.  </w:t>
+      </w:r>
+      <w:r>
+        <w:t>Hardware Validation (before production cut-over)</w:t>
       </w:r>
     </w:p>
     <w:p>
@@ -4756,6 +4786,675 @@
           <w:sz w:val="20"/>
         </w:rPr>
         <w:t>The API listens on localhost only — other machines cannot reach it. Run the calling system on the same PC as the Print Station.</w:t>
+      </w:r>
+    </w:p>
+    <w:p>
+      <w:r>
+        <w:br w:type="page"/>
+      </w:r>
+    </w:p>
+    <w:p>
+      <w:pPr>
+        <w:pStyle w:val="Heading1"/>
+      </w:pPr>
+      <w:r>
+        <w:t>20. Migrating from BarTender</w:t>
+      </w:r>
+    </w:p>
+    <w:p>
+      <w:r>
+        <w:t xml:space="preserve">BarTender's .btw format is a proprietary binary and </w:t>
+      </w:r>
+      <w:r>
+        <w:rPr>
+          <w:b/>
+        </w:rPr>
+        <w:t>cannot be converted losslessly</w:t>
+      </w:r>
+      <w:r>
+        <w:t xml:space="preserve"> — each label is rebuilt once in the Designer. The migration assistant makes the rebuild fast and tracked so nothing is forgotten.</w:t>
+      </w:r>
+    </w:p>
+    <w:p>
+      <w:pPr>
+        <w:pStyle w:val="Heading2"/>
+      </w:pPr>
+      <w:r>
+        <w:t>20.1  The Migration Assistant (Tools &gt; Migrate BarTender Templates…)</w:t>
+      </w:r>
+    </w:p>
+    <w:p>
+      <w:pPr>
+        <w:pStyle w:val="ListNumber"/>
+        <w:spacing w:after="40"/>
+        <w:ind w:left="360"/>
+      </w:pPr>
+      <w:r/>
+      <w:r>
+        <w:rPr>
+          <w:b/>
+        </w:rPr>
+        <w:t>Browse</w:t>
+      </w:r>
+      <w:r>
+        <w:t xml:space="preserve"> to your BarTender template folder and press </w:t>
+      </w:r>
+      <w:r>
+        <w:rPr>
+          <w:b/>
+        </w:rPr>
+        <w:t>Scan</w:t>
+      </w:r>
+      <w:r>
+        <w:t>. Every .btw (subfolders included) is listed with its name, label size and printer read from the file header. Unreadable headers show in red — you can still migrate those, just enter the size yourself.</w:t>
+      </w:r>
+    </w:p>
+    <w:p>
+      <w:pPr>
+        <w:pStyle w:val="ListNumber"/>
+        <w:spacing w:after="40"/>
+        <w:ind w:left="360"/>
+      </w:pPr>
+      <w:r>
+        <w:t xml:space="preserve">Select a file and press </w:t>
+      </w:r>
+      <w:r>
+        <w:rPr>
+          <w:b/>
+        </w:rPr>
+        <w:t>Create skeleton…</w:t>
+      </w:r>
+      <w:r>
+        <w:t xml:space="preserve"> — a .lbl is created with the correct size and name, and optionally: a </w:t>
+      </w:r>
+      <w:r>
+        <w:rPr>
+          <w:b/>
+        </w:rPr>
+        <w:t>backdrop image</w:t>
+      </w:r>
+      <w:r>
+        <w:t xml:space="preserve"> (scan/photo/screenshot of the old label, placed semi-transparent + locked as a tracing aid — it never prints, but still delete the backdrop layer when done) and </w:t>
+      </w:r>
+      <w:r>
+        <w:rPr>
+          <w:b/>
+        </w:rPr>
+        <w:t>fields from the label's data file</w:t>
+      </w:r>
+      <w:r>
+        <w:t xml:space="preserve"> (CSV/Excel headers become the template's fields with the column mapping and data connection already set).</w:t>
+      </w:r>
+    </w:p>
+    <w:p>
+      <w:pPr>
+        <w:pStyle w:val="ListNumber"/>
+        <w:spacing w:after="40"/>
+        <w:ind w:left="360"/>
+      </w:pPr>
+      <w:r>
+        <w:t xml:space="preserve">Press </w:t>
+      </w:r>
+      <w:r>
+        <w:rPr>
+          <w:b/>
+        </w:rPr>
+        <w:t>Open in Designer</w:t>
+      </w:r>
+      <w:r>
+        <w:t xml:space="preserve"> and rebuild the label over the backdrop.</w:t>
+      </w:r>
+    </w:p>
+    <w:p>
+      <w:pPr>
+        <w:pStyle w:val="ListNumber"/>
+        <w:spacing w:after="40"/>
+        <w:ind w:left="360"/>
+      </w:pPr>
+      <w:r>
+        <w:t xml:space="preserve">Test-print, compare against a BarTender-printed sample, scan any barcodes, then set the row's status to </w:t>
+      </w:r>
+      <w:r>
+        <w:rPr>
+          <w:b/>
+        </w:rPr>
+        <w:t>Done</w:t>
+      </w:r>
+      <w:r>
+        <w:t>.</w:t>
+      </w:r>
+    </w:p>
+    <w:p>
+      <w:r/>
+      <w:r>
+        <w:rPr>
+          <w:b/>
+        </w:rPr>
+        <w:t>Statuses:</w:t>
+      </w:r>
+      <w:r>
+        <w:t xml:space="preserve"> Pending → Skeleton created → In progress → Done; use </w:t>
+      </w:r>
+      <w:r>
+        <w:rPr>
+          <w:b/>
+        </w:rPr>
+        <w:t>Skipped</w:t>
+      </w:r>
+      <w:r>
+        <w:t xml:space="preserve"> for obsolete labels. Progress is saved in BtwMigration.json in the shared templates folder, so every station sees the same tracker. </w:t>
+      </w:r>
+      <w:r>
+        <w:rPr>
+          <w:b/>
+        </w:rPr>
+        <w:t>Create all pending</w:t>
+      </w:r>
+      <w:r>
+        <w:t xml:space="preserve"> makes blank skeletons for the whole library in one go.</w:t>
+      </w:r>
+    </w:p>
+    <w:p>
+      <w:pPr>
+        <w:spacing w:before="80" w:after="80"/>
+        <w:ind w:left="432" w:right="432"/>
+        <w:shd w:val="clear" w:color="auto" w:fill="DCE6F1"/>
+      </w:pPr>
+      <w:r>
+        <w:rPr>
+          <w:i/>
+          <w:color w:val="1F497D"/>
+          <w:sz w:val="20"/>
+        </w:rPr>
+        <w:t>A skeleton never overwrites an existing template — if the name is taken it becomes "Name (2)".</w:t>
+      </w:r>
+    </w:p>
+    <w:p>
+      <w:pPr>
+        <w:pStyle w:val="Heading2"/>
+      </w:pPr>
+      <w:r>
+        <w:t>20.2  Order of Work</w:t>
+      </w:r>
+    </w:p>
+    <w:p>
+      <w:pPr>
+        <w:pStyle w:val="ListNumber"/>
+        <w:spacing w:after="40"/>
+        <w:ind w:left="360"/>
+      </w:pPr>
+      <w:r>
+        <w:t>Scan, so the tracker shows the true size of the library.</w:t>
+      </w:r>
+    </w:p>
+    <w:p>
+      <w:pPr>
+        <w:pStyle w:val="ListNumber"/>
+        <w:spacing w:after="40"/>
+        <w:ind w:left="360"/>
+      </w:pPr>
+      <w:r>
+        <w:t>Mark obsolete labels Skipped immediately — don't rebuild what nobody prints.</w:t>
+      </w:r>
+    </w:p>
+    <w:p>
+      <w:pPr>
+        <w:pStyle w:val="ListNumber"/>
+        <w:spacing w:after="40"/>
+        <w:ind w:left="360"/>
+      </w:pPr>
+      <w:r>
+        <w:t>Rebuild the highest-volume labels first; validate each on hardware (Section 21).</w:t>
+      </w:r>
+    </w:p>
+    <w:p>
+      <w:pPr>
+        <w:pStyle w:val="ListNumber"/>
+        <w:spacing w:after="40"/>
+        <w:ind w:left="360"/>
+      </w:pPr>
+      <w:r>
+        <w:t>Keep BarTender installed until every active label is Done — then the licence can lapse.</w:t>
+      </w:r>
+    </w:p>
+    <w:p>
+      <w:r>
+        <w:br w:type="page"/>
+      </w:r>
+    </w:p>
+    <w:p>
+      <w:pPr>
+        <w:pStyle w:val="Heading1"/>
+      </w:pPr>
+      <w:r>
+        <w:t>21. Hardware Validation (before production cut-over)</w:t>
+      </w:r>
+    </w:p>
+    <w:p>
+      <w:r>
+        <w:t xml:space="preserve">Render parity on screen is </w:t>
+      </w:r>
+      <w:r>
+        <w:rPr>
+          <w:b/>
+        </w:rPr>
+        <w:t>not</w:t>
+      </w:r>
+      <w:r>
+        <w:t xml:space="preserve"> proof a label works: barcode scannability, sheet alignment and duplex orientation can only be proven on the physical printer. Run this checklist before switching any label to production, and again after a printer or driver change.</w:t>
+      </w:r>
+    </w:p>
+    <w:p>
+      <w:pPr>
+        <w:pStyle w:val="Heading2"/>
+      </w:pPr>
+      <w:r>
+        <w:t>21.1  Create the Kit</w:t>
+      </w:r>
+    </w:p>
+    <w:p>
+      <w:r/>
+      <w:r>
+        <w:rPr>
+          <w:b/>
+        </w:rPr>
+        <w:t>Tools &gt; Create Print Validation Kit…</w:t>
+      </w:r>
+      <w:r>
+        <w:t xml:space="preserve"> generates the VALIDATE… templates (plus two small CSV data files) into the templates folder. Running it again refreshes them.</w:t>
+      </w:r>
+    </w:p>
+    <w:p>
+      <w:pPr>
+        <w:pStyle w:val="Heading2"/>
+      </w:pPr>
+      <w:r>
+        <w:t>21.2  Thermal Scan Test (Zebra ZD621, 2"x1" stock)</w:t>
+      </w:r>
+    </w:p>
+    <w:tbl>
+      <w:tblPr>
+        <w:tblStyle w:val="TableGrid"/>
+        <w:tblW w:type="auto" w:w="0"/>
+        <w:jc w:val="left"/>
+        <w:tblLook w:firstColumn="1" w:firstRow="1" w:lastColumn="0" w:lastRow="0" w:noHBand="0" w:noVBand="1" w:val="04A0"/>
+      </w:tblPr>
+      <w:tblGrid>
+        <w:gridCol w:w="4703"/>
+        <w:gridCol w:w="4703"/>
+      </w:tblGrid>
+      <w:tr>
+        <w:tc>
+          <w:tcPr>
+            <w:tcW w:type="dxa" w:w="3312"/>
+            <w:shd w:val="clear" w:color="auto" w:fill="1F497D"/>
+          </w:tcPr>
+          <w:p>
+            <w:r>
+              <w:rPr>
+                <w:b/>
+                <w:color w:val="FFFFFF"/>
+                <w:sz w:val="20"/>
+              </w:rPr>
+              <w:t>Template</w:t>
+            </w:r>
+          </w:p>
+        </w:tc>
+        <w:tc>
+          <w:tcPr>
+            <w:tcW w:type="dxa" w:w="6048"/>
+            <w:shd w:val="clear" w:color="auto" w:fill="1F497D"/>
+          </w:tcPr>
+          <w:p>
+            <w:r>
+              <w:rPr>
+                <w:b/>
+                <w:color w:val="FFFFFF"/>
+                <w:sz w:val="20"/>
+              </w:rPr>
+              <w:t>Pass criteria</w:t>
+            </w:r>
+          </w:p>
+        </w:tc>
+      </w:tr>
+      <w:tr>
+        <w:tc>
+          <w:tcPr>
+            <w:tcW w:type="dxa" w:w="3312"/>
+            <w:shd w:val="clear" w:color="auto" w:fill="EEF3FB"/>
+          </w:tcPr>
+          <w:p>
+            <w:r>
+              <w:rPr>
+                <w:sz w:val="20"/>
+              </w:rPr>
+            </w:r>
+            <w:r>
+              <w:t>VALIDATE Zebra Code 128 GDI</w:t>
+            </w:r>
+          </w:p>
+        </w:tc>
+        <w:tc>
+          <w:tcPr>
+            <w:tcW w:type="dxa" w:w="6048"/>
+            <w:shd w:val="clear" w:color="auto" w:fill="EEF3FB"/>
+          </w:tcPr>
+          <w:p>
+            <w:r>
+              <w:rPr>
+                <w:sz w:val="20"/>
+              </w:rPr>
+            </w:r>
+            <w:r>
+              <w:t>Scanner reads exactly VG20260705, first try, from ~10–30 cm</w:t>
+            </w:r>
+          </w:p>
+        </w:tc>
+      </w:tr>
+      <w:tr>
+        <w:tc>
+          <w:tcPr>
+            <w:tcW w:type="dxa" w:w="3312"/>
+            <w:shd w:val="clear" w:color="auto" w:fill="FFFFFF"/>
+          </w:tcPr>
+          <w:p>
+            <w:r>
+              <w:rPr>
+                <w:sz w:val="20"/>
+              </w:rPr>
+            </w:r>
+            <w:r>
+              <w:t>VALIDATE Zebra Code 128 ZPL</w:t>
+            </w:r>
+          </w:p>
+        </w:tc>
+        <w:tc>
+          <w:tcPr>
+            <w:tcW w:type="dxa" w:w="6048"/>
+            <w:shd w:val="clear" w:color="auto" w:fill="FFFFFF"/>
+          </w:tcPr>
+          <w:p>
+            <w:r>
+              <w:rPr>
+                <w:sz w:val="20"/>
+              </w:rPr>
+            </w:r>
+            <w:r>
+              <w:t>Same — this one uses the native ZPL path (printer-engine barcode)</w:t>
+            </w:r>
+          </w:p>
+        </w:tc>
+      </w:tr>
+      <w:tr>
+        <w:tc>
+          <w:tcPr>
+            <w:tcW w:type="dxa" w:w="3312"/>
+            <w:shd w:val="clear" w:color="auto" w:fill="EEF3FB"/>
+          </w:tcPr>
+          <w:p>
+            <w:r>
+              <w:rPr>
+                <w:sz w:val="20"/>
+              </w:rPr>
+            </w:r>
+            <w:r>
+              <w:t>VALIDATE Zebra GS1-128 GDI</w:t>
+            </w:r>
+          </w:p>
+        </w:tc>
+        <w:tc>
+          <w:tcPr>
+            <w:tcW w:type="dxa" w:w="6048"/>
+            <w:shd w:val="clear" w:color="auto" w:fill="EEF3FB"/>
+          </w:tcPr>
+          <w:p>
+            <w:r>
+              <w:rPr>
+                <w:sz w:val="20"/>
+              </w:rPr>
+            </w:r>
+            <w:r>
+              <w:t>Scanner reads the GS1 payload (01)09506000134352(10)VALID8 (AIs may display without brackets)</w:t>
+            </w:r>
+          </w:p>
+        </w:tc>
+      </w:tr>
+      <w:tr>
+        <w:tc>
+          <w:tcPr>
+            <w:tcW w:type="dxa" w:w="3312"/>
+            <w:shd w:val="clear" w:color="auto" w:fill="FFFFFF"/>
+          </w:tcPr>
+          <w:p>
+            <w:r>
+              <w:rPr>
+                <w:sz w:val="20"/>
+              </w:rPr>
+            </w:r>
+            <w:r>
+              <w:t>VALIDATE Zebra QR GDI</w:t>
+            </w:r>
+          </w:p>
+        </w:tc>
+        <w:tc>
+          <w:tcPr>
+            <w:tcW w:type="dxa" w:w="6048"/>
+            <w:shd w:val="clear" w:color="auto" w:fill="FFFFFF"/>
+          </w:tcPr>
+          <w:p>
+            <w:r>
+              <w:rPr>
+                <w:sz w:val="20"/>
+              </w:rPr>
+            </w:r>
+            <w:r>
+              <w:t>Phone camera / scanner reads VANGO-QR-VALIDATE</w:t>
+            </w:r>
+          </w:p>
+        </w:tc>
+      </w:tr>
+    </w:tbl>
+    <w:p/>
+    <w:p>
+      <w:r>
+        <w:t xml:space="preserve">On every label also </w:t>
+      </w:r>
+      <w:r>
+        <w:rPr>
+          <w:b/>
+        </w:rPr>
+        <w:t>measure the printed border box: it must be 46.8 x 21.4 mm (± 0.5 mm)</w:t>
+      </w:r>
+      <w:r>
+        <w:t>. Wrong size = DPI mismatch — check the template DPI (203) matches the printer model, and the driver's stock size.</w:t>
+      </w:r>
+    </w:p>
+    <w:p>
+      <w:r>
+        <w:t xml:space="preserve">If bars look grey or bleed: adjust </w:t>
+      </w:r>
+      <w:r>
+        <w:rPr>
+          <w:b/>
+        </w:rPr>
+        <w:t>darkness</w:t>
+      </w:r>
+      <w:r>
+        <w:t xml:space="preserve"> (Label Setup) and clean the printhead, then re-test. If GDI scans but ZPL doesn't (or vice versa), note which — the paths are independent; use the passing one until resolved.</w:t>
+      </w:r>
+    </w:p>
+    <w:p>
+      <w:pPr>
+        <w:pStyle w:val="Heading2"/>
+      </w:pPr>
+      <w:r>
+        <w:t>21.3  Avery 5160 Sheet Alignment (laser printers)</w:t>
+      </w:r>
+    </w:p>
+    <w:p>
+      <w:pPr>
+        <w:pStyle w:val="ListNumber"/>
+        <w:spacing w:after="40"/>
+        <w:ind w:left="360"/>
+      </w:pPr>
+      <w:r>
+        <w:t>Load a blank Avery 5160 (or 8160) sheet in the office printer.</w:t>
+      </w:r>
+    </w:p>
+    <w:p>
+      <w:pPr>
+        <w:pStyle w:val="ListNumber"/>
+        <w:spacing w:after="40"/>
+        <w:ind w:left="360"/>
+      </w:pPr>
+      <w:r>
+        <w:t>Open VALIDATE 5160 Alignment — its 30-row data file loads automatically. Print all records (one full sheet).</w:t>
+      </w:r>
+    </w:p>
+    <w:p>
+      <w:pPr>
+        <w:pStyle w:val="ListNumber"/>
+        <w:spacing w:after="40"/>
+        <w:ind w:left="360"/>
+      </w:pPr>
+      <w:r/>
+      <w:r>
+        <w:rPr>
+          <w:b/>
+        </w:rPr>
+        <w:t>Pass:</w:t>
+      </w:r>
+      <w:r>
+        <w:t xml:space="preserve"> every cell's border sits on the label die-cuts; cells are numbered 1–30 left-to-right, top-to-bottom.</w:t>
+      </w:r>
+    </w:p>
+    <w:p>
+      <w:pPr>
+        <w:pStyle w:val="ListNumber"/>
+        <w:spacing w:after="40"/>
+        <w:ind w:left="360"/>
+      </w:pPr>
+      <w:r/>
+      <w:r>
+        <w:rPr>
+          <w:b/>
+        </w:rPr>
+        <w:t>Drift?</w:t>
+      </w:r>
+      <w:r>
+        <w:t xml:space="preserve"> Measure the offset in mm and adjust Margin left / Margin top in Template &gt; Page Setup by that amount. Uniform-scale errors must be fixed in the print driver — scaling must be 100% / Actual size.</w:t>
+      </w:r>
+    </w:p>
+    <w:p>
+      <w:pPr>
+        <w:pStyle w:val="ListNumber"/>
+        <w:spacing w:after="40"/>
+        <w:ind w:left="360"/>
+      </w:pPr>
+      <w:r>
+        <w:t xml:space="preserve">Repeat on </w:t>
+      </w:r>
+      <w:r>
+        <w:rPr>
+          <w:b/>
+        </w:rPr>
+        <w:t>each</w:t>
+      </w:r>
+      <w:r>
+        <w:t xml:space="preserve"> laser printer used for sheets — margins differ per device.</w:t>
+      </w:r>
+    </w:p>
+    <w:p>
+      <w:pPr>
+        <w:pStyle w:val="Heading2"/>
+      </w:pPr>
+      <w:r>
+        <w:t>21.4  Duplex Orientation (two-sided cards)</w:t>
+      </w:r>
+    </w:p>
+    <w:p>
+      <w:pPr>
+        <w:pStyle w:val="ListNumber"/>
+        <w:spacing w:after="40"/>
+        <w:ind w:left="360"/>
+      </w:pPr>
+      <w:r>
+        <w:t xml:space="preserve">Open VALIDATE Duplex Front (its 6-row data file loads automatically) and print all records </w:t>
+      </w:r>
+      <w:r>
+        <w:rPr>
+          <w:b/>
+        </w:rPr>
+        <w:t>duplex</w:t>
+      </w:r>
+      <w:r>
+        <w:t xml:space="preserve"> on Letter.</w:t>
+      </w:r>
+    </w:p>
+    <w:p>
+      <w:pPr>
+        <w:pStyle w:val="ListNumber"/>
+        <w:spacing w:after="40"/>
+        <w:ind w:left="360"/>
+      </w:pPr>
+      <w:r>
+        <w:t xml:space="preserve">Hold the sheet up to the light. </w:t>
+      </w:r>
+      <w:r>
+        <w:rPr>
+          <w:b/>
+        </w:rPr>
+        <w:t>Pass:</w:t>
+      </w:r>
+      <w:r>
+        <w:t xml:space="preserve"> each FRONT card's TOP-LEFT marker sits exactly behind the BACK card's TOP-LEFT for the same cell number, and both TOP EDGE arrows point the same way.</w:t>
+      </w:r>
+    </w:p>
+    <w:p>
+      <w:pPr>
+        <w:pStyle w:val="ListNumber"/>
+        <w:spacing w:after="40"/>
+        <w:ind w:left="360"/>
+      </w:pPr>
+      <w:r/>
+      <w:r>
+        <w:rPr>
+          <w:b/>
+        </w:rPr>
+        <w:t>Back upside-down?</w:t>
+      </w:r>
+      <w:r>
+        <w:t xml:space="preserve"> The printer flipped on the short edge — set the driver/duplex option to long-edge flip.</w:t>
+      </w:r>
+    </w:p>
+    <w:p>
+      <w:pPr>
+        <w:pStyle w:val="ListNumber"/>
+        <w:spacing w:after="40"/>
+        <w:ind w:left="360"/>
+      </w:pPr>
+      <w:r/>
+      <w:r>
+        <w:rPr>
+          <w:b/>
+        </w:rPr>
+        <w:t>Backs behind the wrong column?</w:t>
+      </w:r>
+      <w:r>
+        <w:t xml:space="preserve"> Report it — the column mirroring is computed by the app and must not be worked around by editing templates.</w:t>
+      </w:r>
+    </w:p>
+    <w:p>
+      <w:pPr>
+        <w:pStyle w:val="Heading2"/>
+      </w:pPr>
+      <w:r>
+        <w:t>21.5  Sign-Off</w:t>
+      </w:r>
+    </w:p>
+    <w:p>
+      <w:r>
+        <w:t>A label design goes to production only after: (1) its barcodes scan on the production printer, (2) dimensions/alignment pass on the actual stock, and (3) — for serialized labels — a 2–3 label test batch shows serials advancing. Record the date and printer in the migration tracker's Notes or the template name.</w:t>
       </w:r>
     </w:p>
     <w:p/>
@@ -28976,10 +29675,243 @@
 <b:Sources xmlns:b="http://schemas.openxmlformats.org/officeDocument/2006/bibliography" xmlns="http://schemas.openxmlformats.org/officeDocument/2006/bibliography" SelectedStyle="/APA.XSL" StyleName="APA"/>
 </file>
 
+<file path=customXml/item2.xml><?xml version="1.0" encoding="utf-8"?>
+<ct:contentTypeSchema xmlns:ct="http://schemas.microsoft.com/office/2006/metadata/contentType" xmlns:ma="http://schemas.microsoft.com/office/2006/metadata/properties/metaAttributes" ct:_="" ma:_="" ma:contentTypeName="Document" ma:contentTypeID="0x010100DFC90E4B0B3CE449ACCEDC26AC338C2C" ma:contentTypeVersion="12" ma:contentTypeDescription="Create a new document." ma:contentTypeScope="" ma:versionID="7f6a08671d18325d888013bfeec6da04">
+  <xsd:schema xmlns:xsd="http://www.w3.org/2001/XMLSchema" xmlns:xs="http://www.w3.org/2001/XMLSchema" xmlns:p="http://schemas.microsoft.com/office/2006/metadata/properties" xmlns:ns2="da16cc80-aa8b-43af-9f8f-d6f1ccb4c6ef" xmlns:ns3="deb8d40d-277f-44a8-b662-8daf987f64bc" targetNamespace="http://schemas.microsoft.com/office/2006/metadata/properties" ma:root="true" ma:fieldsID="fcbee57e1cb31a38131eeb5dabf452cc" ns2:_="" ns3:_="">
+    <xsd:import namespace="da16cc80-aa8b-43af-9f8f-d6f1ccb4c6ef"/>
+    <xsd:import namespace="deb8d40d-277f-44a8-b662-8daf987f64bc"/>
+    <xsd:element name="properties">
+      <xsd:complexType>
+        <xsd:sequence>
+          <xsd:element name="documentManagement">
+            <xsd:complexType>
+              <xsd:all>
+                <xsd:element ref="ns2:lcf76f155ced4ddcb4097134ff3c332f" minOccurs="0"/>
+                <xsd:element ref="ns3:TaxCatchAll" minOccurs="0"/>
+                <xsd:element ref="ns2:MediaServiceMetadata" minOccurs="0"/>
+                <xsd:element ref="ns2:MediaServiceFastMetadata" minOccurs="0"/>
+                <xsd:element ref="ns2:MediaServiceObjectDetectorVersions" minOccurs="0"/>
+                <xsd:element ref="ns2:MediaServiceOCR" minOccurs="0"/>
+                <xsd:element ref="ns2:MediaServiceGenerationTime" minOccurs="0"/>
+                <xsd:element ref="ns2:MediaServiceEventHashCode" minOccurs="0"/>
+                <xsd:element ref="ns2:MediaServiceSearchProperties" minOccurs="0"/>
+                <xsd:element ref="ns2:MediaServiceDateTaken" minOccurs="0"/>
+                <xsd:element ref="ns2:MediaLengthInSeconds" minOccurs="0"/>
+              </xsd:all>
+            </xsd:complexType>
+          </xsd:element>
+        </xsd:sequence>
+      </xsd:complexType>
+    </xsd:element>
+  </xsd:schema>
+  <xsd:schema xmlns:xsd="http://www.w3.org/2001/XMLSchema" xmlns:xs="http://www.w3.org/2001/XMLSchema" xmlns:dms="http://schemas.microsoft.com/office/2006/documentManagement/types" xmlns:pc="http://schemas.microsoft.com/office/infopath/2007/PartnerControls" targetNamespace="da16cc80-aa8b-43af-9f8f-d6f1ccb4c6ef" elementFormDefault="qualified">
+    <xsd:import namespace="http://schemas.microsoft.com/office/2006/documentManagement/types"/>
+    <xsd:import namespace="http://schemas.microsoft.com/office/infopath/2007/PartnerControls"/>
+    <xsd:element name="lcf76f155ced4ddcb4097134ff3c332f" ma:index="9" nillable="true" ma:taxonomy="true" ma:internalName="lcf76f155ced4ddcb4097134ff3c332f" ma:taxonomyFieldName="MediaServiceImageTags" ma:displayName="Image Tags" ma:readOnly="false" ma:fieldId="{5cf76f15-5ced-4ddc-b409-7134ff3c332f}" ma:taxonomyMulti="true" ma:sspId="d18675b8-ebf9-4101-84d0-692d769b46d3" ma:termSetId="09814cd3-568e-fe90-9814-8d621ff8fb84" ma:anchorId="fba54fb3-c3e1-fe81-a776-ca4b69148c4d" ma:open="true" ma:isKeyword="false">
+      <xsd:complexType>
+        <xsd:sequence>
+          <xsd:element ref="pc:Terms" minOccurs="0" maxOccurs="1"/>
+        </xsd:sequence>
+      </xsd:complexType>
+    </xsd:element>
+    <xsd:element name="MediaServiceMetadata" ma:index="11" nillable="true" ma:displayName="MediaServiceMetadata" ma:hidden="true" ma:internalName="MediaServiceMetadata" ma:readOnly="true">
+      <xsd:simpleType>
+        <xsd:restriction base="dms:Note"/>
+      </xsd:simpleType>
+    </xsd:element>
+    <xsd:element name="MediaServiceFastMetadata" ma:index="12" nillable="true" ma:displayName="MediaServiceFastMetadata" ma:hidden="true" ma:internalName="MediaServiceFastMetadata" ma:readOnly="true">
+      <xsd:simpleType>
+        <xsd:restriction base="dms:Note"/>
+      </xsd:simpleType>
+    </xsd:element>
+    <xsd:element name="MediaServiceObjectDetectorVersions" ma:index="13" nillable="true" ma:displayName="MediaServiceObjectDetectorVersions" ma:hidden="true" ma:indexed="true" ma:internalName="MediaServiceObjectDetectorVersions" ma:readOnly="true">
+      <xsd:simpleType>
+        <xsd:restriction base="dms:Text"/>
+      </xsd:simpleType>
+    </xsd:element>
+    <xsd:element name="MediaServiceOCR" ma:index="14" nillable="true" ma:displayName="Extracted Text" ma:internalName="MediaServiceOCR" ma:readOnly="true">
+      <xsd:simpleType>
+        <xsd:restriction base="dms:Note">
+          <xsd:maxLength value="255"/>
+        </xsd:restriction>
+      </xsd:simpleType>
+    </xsd:element>
+    <xsd:element name="MediaServiceGenerationTime" ma:index="15" nillable="true" ma:displayName="MediaServiceGenerationTime" ma:hidden="true" ma:internalName="MediaServiceGenerationTime" ma:readOnly="true">
+      <xsd:simpleType>
+        <xsd:restriction base="dms:Text"/>
+      </xsd:simpleType>
+    </xsd:element>
+    <xsd:element name="MediaServiceEventHashCode" ma:index="16" nillable="true" ma:displayName="MediaServiceEventHashCode" ma:hidden="true" ma:internalName="MediaServiceEventHashCode" ma:readOnly="true">
+      <xsd:simpleType>
+        <xsd:restriction base="dms:Text"/>
+      </xsd:simpleType>
+    </xsd:element>
+    <xsd:element name="MediaServiceSearchProperties" ma:index="17" nillable="true" ma:displayName="MediaServiceSearchProperties" ma:hidden="true" ma:internalName="MediaServiceSearchProperties" ma:readOnly="true">
+      <xsd:simpleType>
+        <xsd:restriction base="dms:Note"/>
+      </xsd:simpleType>
+    </xsd:element>
+    <xsd:element name="MediaServiceDateTaken" ma:index="18" nillable="true" ma:displayName="MediaServiceDateTaken" ma:hidden="true" ma:indexed="true" ma:internalName="MediaServiceDateTaken" ma:readOnly="true">
+      <xsd:simpleType>
+        <xsd:restriction base="dms:Text"/>
+      </xsd:simpleType>
+    </xsd:element>
+    <xsd:element name="MediaLengthInSeconds" ma:index="19" nillable="true" ma:displayName="MediaLengthInSeconds" ma:hidden="true" ma:internalName="MediaLengthInSeconds" ma:readOnly="true">
+      <xsd:simpleType>
+        <xsd:restriction base="dms:Unknown"/>
+      </xsd:simpleType>
+    </xsd:element>
+  </xsd:schema>
+  <xsd:schema xmlns:xsd="http://www.w3.org/2001/XMLSchema" xmlns:xs="http://www.w3.org/2001/XMLSchema" xmlns:dms="http://schemas.microsoft.com/office/2006/documentManagement/types" xmlns:pc="http://schemas.microsoft.com/office/infopath/2007/PartnerControls" targetNamespace="deb8d40d-277f-44a8-b662-8daf987f64bc" elementFormDefault="qualified">
+    <xsd:import namespace="http://schemas.microsoft.com/office/2006/documentManagement/types"/>
+    <xsd:import namespace="http://schemas.microsoft.com/office/infopath/2007/PartnerControls"/>
+    <xsd:element name="TaxCatchAll" ma:index="10" nillable="true" ma:displayName="Taxonomy Catch All Column" ma:hidden="true" ma:list="{ba19c7b2-cba1-493a-96ab-c41e934c3b00}" ma:internalName="TaxCatchAll" ma:showField="CatchAllData" ma:web="deb8d40d-277f-44a8-b662-8daf987f64bc">
+      <xsd:complexType>
+        <xsd:complexContent>
+          <xsd:extension base="dms:MultiChoiceLookup">
+            <xsd:sequence>
+              <xsd:element name="Value" type="dms:Lookup" maxOccurs="unbounded" minOccurs="0" nillable="true"/>
+            </xsd:sequence>
+          </xsd:extension>
+        </xsd:complexContent>
+      </xsd:complexType>
+    </xsd:element>
+  </xsd:schema>
+  <xsd:schema xmlns="http://schemas.openxmlformats.org/package/2006/metadata/core-properties" xmlns:xsd="http://www.w3.org/2001/XMLSchema" xmlns:xsi="http://www.w3.org/2001/XMLSchema-instance" xmlns:dc="http://purl.org/dc/elements/1.1/" xmlns:dcterms="http://purl.org/dc/terms/" xmlns:odoc="http://schemas.microsoft.com/internal/obd" targetNamespace="http://schemas.openxmlformats.org/package/2006/metadata/core-properties" elementFormDefault="qualified" attributeFormDefault="unqualified" blockDefault="#all">
+    <xsd:import namespace="http://purl.org/dc/elements/1.1/" schemaLocation="http://dublincore.org/schemas/xmls/qdc/2003/04/02/dc.xsd"/>
+    <xsd:import namespace="http://purl.org/dc/terms/" schemaLocation="http://dublincore.org/schemas/xmls/qdc/2003/04/02/dcterms.xsd"/>
+    <xsd:element name="coreProperties" type="CT_coreProperties"/>
+    <xsd:complexType name="CT_coreProperties">
+      <xsd:all>
+        <xsd:element ref="dc:creator" minOccurs="0" maxOccurs="1"/>
+        <xsd:element ref="dcterms:created" minOccurs="0" maxOccurs="1"/>
+        <xsd:element ref="dc:identifier" minOccurs="0" maxOccurs="1"/>
+        <xsd:element name="contentType" minOccurs="0" maxOccurs="1" type="xsd:string" ma:index="0" ma:displayName="Content Type"/>
+        <xsd:element ref="dc:title" minOccurs="0" maxOccurs="1" ma:index="4" ma:displayName="Title"/>
+        <xsd:element ref="dc:subject" minOccurs="0" maxOccurs="1"/>
+        <xsd:element ref="dc:description" minOccurs="0" maxOccurs="1"/>
+        <xsd:element name="keywords" minOccurs="0" maxOccurs="1" type="xsd:string"/>
+        <xsd:element ref="dc:language" minOccurs="0" maxOccurs="1"/>
+        <xsd:element name="category" minOccurs="0" maxOccurs="1" type="xsd:string"/>
+        <xsd:element name="version" minOccurs="0" maxOccurs="1" type="xsd:string"/>
+        <xsd:element name="revision" minOccurs="0" maxOccurs="1" type="xsd:string">
+          <xsd:annotation>
+            <xsd:documentation>
+                        This value indicates the number of saves or revisions. The application is responsible for updating this value after each revision.
+                    </xsd:documentation>
+          </xsd:annotation>
+        </xsd:element>
+        <xsd:element name="lastModifiedBy" minOccurs="0" maxOccurs="1" type="xsd:string"/>
+        <xsd:element ref="dcterms:modified" minOccurs="0" maxOccurs="1"/>
+        <xsd:element name="contentStatus" minOccurs="0" maxOccurs="1" type="xsd:string"/>
+      </xsd:all>
+    </xsd:complexType>
+  </xsd:schema>
+  <xs:schema xmlns:pc="http://schemas.microsoft.com/office/infopath/2007/PartnerControls" xmlns:xs="http://www.w3.org/2001/XMLSchema" targetNamespace="http://schemas.microsoft.com/office/infopath/2007/PartnerControls" elementFormDefault="qualified" attributeFormDefault="unqualified">
+    <xs:element name="Person">
+      <xs:complexType>
+        <xs:sequence>
+          <xs:element ref="pc:DisplayName" minOccurs="0"/>
+          <xs:element ref="pc:AccountId" minOccurs="0"/>
+          <xs:element ref="pc:AccountType" minOccurs="0"/>
+        </xs:sequence>
+      </xs:complexType>
+    </xs:element>
+    <xs:element name="DisplayName" type="xs:string"/>
+    <xs:element name="AccountId" type="xs:string"/>
+    <xs:element name="AccountType" type="xs:string"/>
+    <xs:element name="BDCAssociatedEntity">
+      <xs:complexType>
+        <xs:sequence>
+          <xs:element ref="pc:BDCEntity" minOccurs="0" maxOccurs="unbounded"/>
+        </xs:sequence>
+        <xs:attribute ref="pc:EntityNamespace"/>
+        <xs:attribute ref="pc:EntityName"/>
+        <xs:attribute ref="pc:SystemInstanceName"/>
+        <xs:attribute ref="pc:AssociationName"/>
+      </xs:complexType>
+    </xs:element>
+    <xs:attribute name="EntityNamespace" type="xs:string"/>
+    <xs:attribute name="EntityName" type="xs:string"/>
+    <xs:attribute name="SystemInstanceName" type="xs:string"/>
+    <xs:attribute name="AssociationName" type="xs:string"/>
+    <xs:element name="BDCEntity">
+      <xs:complexType>
+        <xs:sequence>
+          <xs:element ref="pc:EntityDisplayName" minOccurs="0"/>
+          <xs:element ref="pc:EntityInstanceReference" minOccurs="0"/>
+          <xs:element ref="pc:EntityId1" minOccurs="0"/>
+          <xs:element ref="pc:EntityId2" minOccurs="0"/>
+          <xs:element ref="pc:EntityId3" minOccurs="0"/>
+          <xs:element ref="pc:EntityId4" minOccurs="0"/>
+          <xs:element ref="pc:EntityId5" minOccurs="0"/>
+        </xs:sequence>
+      </xs:complexType>
+    </xs:element>
+    <xs:element name="EntityDisplayName" type="xs:string"/>
+    <xs:element name="EntityInstanceReference" type="xs:string"/>
+    <xs:element name="EntityId1" type="xs:string"/>
+    <xs:element name="EntityId2" type="xs:string"/>
+    <xs:element name="EntityId3" type="xs:string"/>
+    <xs:element name="EntityId4" type="xs:string"/>
+    <xs:element name="EntityId5" type="xs:string"/>
+    <xs:element name="Terms">
+      <xs:complexType>
+        <xs:sequence>
+          <xs:element ref="pc:TermInfo" minOccurs="0" maxOccurs="unbounded"/>
+        </xs:sequence>
+      </xs:complexType>
+    </xs:element>
+    <xs:element name="TermInfo">
+      <xs:complexType>
+        <xs:sequence>
+          <xs:element ref="pc:TermName" minOccurs="0"/>
+          <xs:element ref="pc:TermId" minOccurs="0"/>
+        </xs:sequence>
+      </xs:complexType>
+    </xs:element>
+    <xs:element name="TermName" type="xs:string"/>
+    <xs:element name="TermId" type="xs:string"/>
+  </xs:schema>
+</ct:contentTypeSchema>
+</file>
+
+<file path=customXml/item3.xml><?xml version="1.0" encoding="utf-8"?>
+<?mso-contentType ?>
+<FormTemplates xmlns="http://schemas.microsoft.com/sharepoint/v3/contenttype/forms">
+  <Display>DocumentLibraryForm</Display>
+  <Edit>DocumentLibraryForm</Edit>
+  <New>DocumentLibraryForm</New>
+</FormTemplates>
+</file>
+
+<file path=customXml/item4.xml><?xml version="1.0" encoding="utf-8"?>
+<p:properties xmlns:p="http://schemas.microsoft.com/office/2006/metadata/properties" xmlns:xsi="http://www.w3.org/2001/XMLSchema-instance" xmlns:pc="http://schemas.microsoft.com/office/infopath/2007/PartnerControls">
+  <documentManagement>
+    <TaxCatchAll xmlns="deb8d40d-277f-44a8-b662-8daf987f64bc" xsi:nil="true"/>
+    <lcf76f155ced4ddcb4097134ff3c332f xmlns="da16cc80-aa8b-43af-9f8f-d6f1ccb4c6ef">
+      <Terms xmlns="http://schemas.microsoft.com/office/infopath/2007/PartnerControls"/>
+    </lcf76f155ced4ddcb4097134ff3c332f>
+  </documentManagement>
+</p:properties>
+</file>
+
 <file path=customXml/itemProps1.xml><?xml version="1.0" encoding="utf-8"?>
 <ds:datastoreItem xmlns:ds="http://schemas.openxmlformats.org/officeDocument/2006/customXml" ds:itemID="{EF278816-EC6F-A645-907D-7F25AECB1D4A}">
   <ds:schemaRefs>
     <ds:schemaRef ds:uri="http://schemas.openxmlformats.org/officeDocument/2006/bibliography"/>
   </ds:schemaRefs>
 </ds:datastoreItem>
+</file>
+
+<file path=customXml/itemProps2.xml><?xml version="1.0" encoding="utf-8"?>
+<ds:datastoreItem xmlns:ds="http://schemas.openxmlformats.org/officeDocument/2006/customXml" ds:itemID="{320731C3-C5E3-4AB3-B435-3DBF219EC30B}"/>
+</file>
+
+<file path=customXml/itemProps3.xml><?xml version="1.0" encoding="utf-8"?>
+<ds:datastoreItem xmlns:ds="http://schemas.openxmlformats.org/officeDocument/2006/customXml" ds:itemID="{48C442DB-9F41-4B74-B7B2-70313B9F6AE0}"/>
+</file>
+
+<file path=customXml/itemProps4.xml><?xml version="1.0" encoding="utf-8"?>
+<ds:datastoreItem xmlns:ds="http://schemas.openxmlformats.org/officeDocument/2006/customXml" ds:itemID="{5D99F94E-B707-4933-A50E-3D9FCC1C5841}"/>
 </file>
</xml_diff>